<commit_message>
Integra generacion de codigos QR en vistas de posters
</commit_message>
<xml_diff>
--- a/src/assets/documentacion/requirimientos poster delfin.docx
+++ b/src/assets/documentacion/requirimientos poster delfin.docx
@@ -1383,12 +1383,12 @@
         </w:numPr>
         <w:rPr>
           <w:highlight w:val="none"/>
-          <w:shd w:fill="FF8000" w:val="clear"/>
-        </w:rPr>
-      </w:pPr>
-      <w:r>
-        <w:rPr>
-          <w:shd w:fill="FF8000" w:val="clear"/>
+          <w:shd w:fill="81D41A" w:val="clear"/>
+        </w:rPr>
+      </w:pPr>
+      <w:r>
+        <w:rPr>
+          <w:shd w:fill="81D41A" w:val="clear"/>
           <w:lang w:val="es-CO"/>
         </w:rPr>
         <w:t>El administrador debe poder asignar uno o varios evaluadores a cada póster.</w:t>
@@ -1423,12 +1423,12 @@
         </w:numPr>
         <w:rPr>
           <w:highlight w:val="none"/>
-          <w:shd w:fill="FF8000" w:val="clear"/>
-        </w:rPr>
-      </w:pPr>
-      <w:r>
-        <w:rPr>
-          <w:shd w:fill="FF8000" w:val="clear"/>
+          <w:shd w:fill="81D41A" w:val="clear"/>
+        </w:rPr>
+      </w:pPr>
+      <w:r>
+        <w:rPr>
+          <w:shd w:fill="81D41A" w:val="clear"/>
           <w:lang w:val="es-CO"/>
         </w:rPr>
         <w:t>La aplicación debe registrar la asignación de cada evaluador a cada póster.</w:t>
@@ -1481,12 +1481,12 @@
         </w:numPr>
         <w:rPr>
           <w:highlight w:val="none"/>
-          <w:shd w:fill="FF8000" w:val="clear"/>
-        </w:rPr>
-      </w:pPr>
-      <w:r>
-        <w:rPr>
-          <w:shd w:fill="FF8000" w:val="clear"/>
+          <w:shd w:fill="81D41A" w:val="clear"/>
+        </w:rPr>
+      </w:pPr>
+      <w:r>
+        <w:rPr>
+          <w:shd w:fill="81D41A" w:val="clear"/>
           <w:lang w:val="es-CO"/>
         </w:rPr>
         <w:t>El administrador debe poder definir los espacios físicos disponibles para la colocación de los pósteres (ej: Sala A, Pasillo Central, etc.).</w:t>
@@ -1498,6 +1498,26 @@
         <w:numPr>
           <w:ilvl w:val="2"/>
           <w:numId w:val="8"/>
+        </w:numPr>
+        <w:rPr>
+          <w:highlight w:val="none"/>
+          <w:shd w:fill="81D41A" w:val="clear"/>
+        </w:rPr>
+      </w:pPr>
+      <w:r>
+        <w:rPr>
+          <w:shd w:fill="81D41A" w:val="clear"/>
+          <w:lang w:val="es-CO"/>
+        </w:rPr>
+        <w:t>Para cada espacio, se debe poder definir la capacidad (número máximo de pósteres que puede albergar).</w:t>
+      </w:r>
+    </w:p>
+    <w:p>
+      <w:pPr>
+        <w:pStyle w:val="Normal"/>
+        <w:numPr>
+          <w:ilvl w:val="1"/>
+          <w:numId w:val="1"/>
         </w:numPr>
         <w:rPr>
           <w:highlight w:val="none"/>
@@ -1506,17 +1526,24 @@
       </w:pPr>
       <w:r>
         <w:rPr>
+          <w:b/>
+          <w:bCs/>
           <w:shd w:fill="FF8000" w:val="clear"/>
-          <w:lang w:val="es-CO"/>
-        </w:rPr>
-        <w:t>Para cada espacio, se debe poder definir la capacidad (número máximo de pósteres que puede albergar).</w:t>
-      </w:r>
-    </w:p>
-    <w:p>
-      <w:pPr>
-        <w:pStyle w:val="Normal"/>
-        <w:numPr>
-          <w:ilvl w:val="1"/>
+        </w:rPr>
+        <w:t>Asignación de Espacio:</w:t>
+      </w:r>
+      <w:r>
+        <w:rPr>
+          <w:shd w:fill="FF8000" w:val="clear"/>
+        </w:rPr>
+        <w:t xml:space="preserve"> </w:t>
+      </w:r>
+    </w:p>
+    <w:p>
+      <w:pPr>
+        <w:pStyle w:val="Normal"/>
+        <w:numPr>
+          <w:ilvl w:val="2"/>
           <w:numId w:val="1"/>
         </w:numPr>
         <w:rPr>
@@ -1526,17 +1553,10 @@
       </w:pPr>
       <w:r>
         <w:rPr>
-          <w:b/>
-          <w:bCs/>
           <w:shd w:fill="FF8000" w:val="clear"/>
-        </w:rPr>
-        <w:t>Asignación de Espacio:</w:t>
-      </w:r>
-      <w:r>
-        <w:rPr>
-          <w:shd w:fill="FF8000" w:val="clear"/>
-        </w:rPr>
-        <w:t xml:space="preserve"> </w:t>
+          <w:lang w:val="es-CO"/>
+        </w:rPr>
+        <w:t>El administrador debe poder asignar un espacio físico específico a cada póster.</w:t>
       </w:r>
     </w:p>
     <w:p>
@@ -1548,32 +1568,12 @@
         </w:numPr>
         <w:rPr>
           <w:highlight w:val="none"/>
-          <w:shd w:fill="FF8000" w:val="clear"/>
-        </w:rPr>
-      </w:pPr>
-      <w:r>
-        <w:rPr>
-          <w:shd w:fill="FF8000" w:val="clear"/>
-          <w:lang w:val="es-CO"/>
-        </w:rPr>
-        <w:t>El administrador debe poder asignar un espacio físico específico a cada póster.</w:t>
-      </w:r>
-    </w:p>
-    <w:p>
-      <w:pPr>
-        <w:pStyle w:val="Normal"/>
-        <w:numPr>
-          <w:ilvl w:val="2"/>
-          <w:numId w:val="1"/>
-        </w:numPr>
-        <w:rPr>
-          <w:highlight w:val="none"/>
-          <w:shd w:fill="FF8000" w:val="clear"/>
-        </w:rPr>
-      </w:pPr>
-      <w:r>
-        <w:rPr>
-          <w:shd w:fill="FF8000" w:val="clear"/>
+          <w:shd w:fill="81D41A" w:val="clear"/>
+        </w:rPr>
+      </w:pPr>
+      <w:r>
+        <w:rPr>
+          <w:shd w:fill="81D41A" w:val="clear"/>
           <w:lang w:val="es-CO"/>
         </w:rPr>
         <w:t>La aplicación debe controlar la capacidad de cada espacio, evitando sobrepasar el límite.</w:t>

</xml_diff>